<commit_message>
Redesign runnable document demos around current Editor workflows
</commit_message>
<xml_diff>
--- a/examples/proposal/sample.docx
+++ b/examples/proposal/sample.docx
@@ -1,13 +1,53 @@
 
 <file path=word/document.xml><?xml version="1.0" encoding="utf-8"?>
-<w:document xmlns:w="http://schemas.openxmlformats.org/wordprocessingml/2006/main">
+<w:document xmlns:w="http://schemas.openxmlformats.org/wordprocessingml/2006/main" xmlns:r="http://schemas.openxmlformats.org/officeDocument/2006/relationships">
   <w:body>
     <w:p>
       <w:pPr>
         <w:pStyle w:val="Brand"/>
       </w:pPr>
-      <w:r>
-        <w:t xml:space="preserve">NORTHLINE / STUDIO</w:t>
+      <w:sdt>
+        <w:sdtPr>
+          <w:tag w:val="onodocs:{&quot;kind&quot;:&quot;image&quot;,&quot;path&quot;:[&quot;logo&quot;],&quot;width&quot;:20,&quot;height&quot;:20,&quot;description&quot;:&quot;Northline Studio&quot;}"/>
+        </w:sdtPr>
+        <w:sdtContent>
+          <w:r>
+            <w:drawing>
+              <wp:inline xmlns:wp="http://schemas.openxmlformats.org/drawingml/2006/wordprocessingDrawing">
+                <wp:extent cx="254000" cy="254000"/>
+                <wp:docPr id="1" name="Northline Studio mark" descr="Northline Studio"/>
+                <a:graphic xmlns:a="http://schemas.openxmlformats.org/drawingml/2006/main">
+                  <a:graphicData uri="http://schemas.openxmlformats.org/drawingml/2006/picture">
+                    <pic:pic xmlns:pic="http://schemas.openxmlformats.org/drawingml/2006/picture">
+                      <pic:nvPicPr>
+                        <pic:cNvPr id="1" name="Northline Studio"/>
+                        <pic:cNvPicPr/>
+                      </pic:nvPicPr>
+                      <pic:blipFill>
+                        <a:blip r:embed="rIdlogo"/>
+                        <a:stretch>
+                          <a:fillRect/>
+                        </a:stretch>
+                      </pic:blipFill>
+                      <pic:spPr>
+                        <a:xfrm>
+                          <a:off x="0" y="0"/>
+                          <a:ext cx="254000" cy="254000"/>
+                        </a:xfrm>
+                        <a:prstGeom prst="rect">
+                          <a:avLst/>
+                        </a:prstGeom>
+                      </pic:spPr>
+                    </pic:pic>
+                  </a:graphicData>
+                </a:graphic>
+              </wp:inline>
+            </w:drawing>
+          </w:r>
+        </w:sdtContent>
+      </w:sdt>
+      <w:r>
+        <w:t xml:space="preserve">   NORTHLINE / STUDIO</w:t>
       </w:r>
     </w:p>
     <w:p>
@@ -295,7 +335,7 @@
         </w:sdtPr>
         <w:sdtContent>
           <w:r>
-            <w:t xml:space="preserve">$7,200.00</w:t>
+            <w:t xml:space="preserve">$900.00</w:t>
           </w:r>
         </w:sdtContent>
       </w:sdt>
@@ -331,6 +371,21 @@
         <w:t xml:space="preserve">We will share work in progress, discuss your feedback and agree the next steps together. Fees exclude applicable taxes. A 50% deposit reserves the project; the balance is due at handoff.</w:t>
       </w:r>
     </w:p>
+    <w:sdt>
+      <w:sdtPr>
+        <w:tag w:val="onodocs:{&quot;kind&quot;:&quot;if&quot;,&quot;path&quot;:[&quot;includeSupport&quot;]}"/>
+      </w:sdtPr>
+      <w:sdtContent>
+        <w:p>
+          <w:pPr>
+            <w:pStyle w:val="Normal"/>
+          </w:pPr>
+          <w:r>
+            <w:t xml:space="preserve">Launch support is included: two review calls in the first month after launch to answer your team's questions and agree any follow-up work.</w:t>
+          </w:r>
+        </w:p>
+      </w:sdtContent>
+    </w:sdt>
     <w:p>
       <w:pPr>
         <w:pStyle w:val="Closing"/>
@@ -339,18 +394,88 @@
         <w:t xml:space="preserve">Ready when you are.</w:t>
       </w:r>
     </w:p>
-    <w:p>
-      <w:pPr>
-        <w:pStyle w:val="Meta"/>
-      </w:pPr>
-      <w:r>
-        <w:t xml:space="preserve">Morgan at Northline Studio  /  hello@northline.example</w:t>
-      </w:r>
-    </w:p>
+    <w:sdt>
+      <w:sdtPr>
+        <w:tag w:val="onodocs:{&quot;kind&quot;:&quot;section&quot;,&quot;name&quot;:&quot;studio-contact&quot;}"/>
+      </w:sdtPr>
+      <w:sdtContent>
+        <w:p>
+          <w:pPr>
+            <w:pStyle w:val="Meta"/>
+          </w:pPr>
+          <w:sdt>
+            <w:sdtPr>
+              <w:tag w:val="onodocs:{&quot;kind&quot;:&quot;value&quot;,&quot;path&quot;:[&quot;name&quot;]}"/>
+            </w:sdtPr>
+            <w:sdtContent>
+              <w:r>
+                <w:t xml:space="preserve">Contact name</w:t>
+              </w:r>
+            </w:sdtContent>
+          </w:sdt>
+          <w:r>
+            <w:t xml:space="preserve">  /  </w:t>
+          </w:r>
+          <w:sdt>
+            <w:sdtPr>
+              <w:tag w:val="onodocs:{&quot;kind&quot;:&quot;value&quot;,&quot;path&quot;:[&quot;role&quot;]}"/>
+            </w:sdtPr>
+            <w:sdtContent>
+              <w:r>
+                <w:t xml:space="preserve">Team role</w:t>
+              </w:r>
+            </w:sdtContent>
+          </w:sdt>
+          <w:r>
+            <w:t xml:space="preserve">  /  </w:t>
+          </w:r>
+          <w:sdt>
+            <w:sdtPr>
+              <w:tag w:val="onodocs:{&quot;kind&quot;:&quot;value&quot;,&quot;path&quot;:[&quot;email&quot;]}"/>
+            </w:sdtPr>
+            <w:sdtContent>
+              <w:r>
+                <w:t xml:space="preserve">Email address</w:t>
+              </w:r>
+            </w:sdtContent>
+          </w:sdt>
+        </w:p>
+      </w:sdtContent>
+    </w:sdt>
+    <w:sdt>
+      <w:sdtPr>
+        <w:tag w:val="onodocs:{&quot;kind&quot;:&quot;include&quot;,&quot;name&quot;:&quot;studio-contact&quot;,&quot;path&quot;:[&quot;studioLead&quot;]}"/>
+      </w:sdtPr>
+      <w:sdtContent>
+        <w:p>
+          <w:pPr>
+            <w:pStyle w:val="Meta"/>
+          </w:pPr>
+          <w:r>
+            <w:t xml:space="preserve">Your studio lead</w:t>
+          </w:r>
+        </w:p>
+      </w:sdtContent>
+    </w:sdt>
+    <w:sdt>
+      <w:sdtPr>
+        <w:tag w:val="onodocs:{&quot;kind&quot;:&quot;include&quot;,&quot;name&quot;:&quot;studio-contact&quot;,&quot;path&quot;:[&quot;deliveryLead&quot;]}"/>
+      </w:sdtPr>
+      <w:sdtContent>
+        <w:p>
+          <w:pPr>
+            <w:pStyle w:val="Meta"/>
+          </w:pPr>
+          <w:r>
+            <w:t xml:space="preserve">Your delivery lead</w:t>
+          </w:r>
+        </w:p>
+      </w:sdtContent>
+    </w:sdt>
     <w:sectPr>
-      <w:footerReference xmlns:r="http://schemas.openxmlformats.org/officeDocument/2006/relationships" w:type="default" r:id="rIdfooter"/>
+      <w:footerReference w:type="default" r:id="rIdfooter"/>
       <w:pgSz w:w="12240" w:h="15840"/>
-      <w:pgMar w:top="1080" w:right="1080" w:bottom="1080" w:left="1080" w:header="540" w:footer="540"/>
+      <w:pgMar w:top="900" w:right="1080" w:bottom="900" w:left="1080" w:header="540" w:footer="540"/>
     </w:sectPr>
   </w:body>
 </w:document>

</xml_diff>